<commit_message>
v2 : nettoyage feature engineering, regle de selection eco-responsable, dashboard enrichi
- Suppression de 3 variables redondantes (revenue_per_month doublon exact de monthly_fee, low_satisfaction/inactive_customer redondantes avec satisfaction_score/engagement_score), verifie sans perte de recall par cross-validation repetee avant application

- Regle de selection du modele final renforcee : en cas d'egalite de recall entre modeles, priorite au plus rapide/sobre a entrainer (ecoresponsabilite) plutot qu'un depart mecanique sur la precision

- Modeles, rapports et artefacts regeneres (recall final 87,3% au seuil 0.20)

- Dashboard : graphiques de l'onglet Explication en grille, ajout des courbes ROC/Precision-Recall, jauge de risque et explication SHAP individuelle (simulation client), distribution du risque et matrice de priorisation risque x revenu (vue metier)
</commit_message>
<xml_diff>
--- a/projet_churn_structure/docs/RAPPORT_PROJET.docx
+++ b/projet_churn_structure/docs/RAPPORT_PROJET.docx
@@ -201,94 +201,100 @@
       </w:r>
     </w:p>
     <w:p>
-      <w:pPr>
-        <w:rPr>
-          <w:lang w:val="fr-FR"/>
-        </w:rPr>
-      </w:pPr>
-      <w:r>
-        <w:rPr>
-          <w:lang w:val="fr-FR"/>
-        </w:rPr>
-        <w:t>13. Interface utilisateur et prototype</w:t>
-      </w:r>
-    </w:p>
-    <w:p>
-      <w:pPr>
-        <w:rPr>
-          <w:lang w:val="fr-FR"/>
-        </w:rPr>
-      </w:pPr>
-      <w:r>
-        <w:rPr>
-          <w:lang w:val="fr-FR"/>
-        </w:rPr>
-        <w:t>14. API REST (optionnelle)</w:t>
-      </w:r>
-    </w:p>
-    <w:p>
-      <w:pPr>
-        <w:rPr>
-          <w:lang w:val="fr-FR"/>
-        </w:rPr>
-      </w:pPr>
-      <w:r>
-        <w:rPr>
-          <w:lang w:val="fr-FR"/>
-        </w:rPr>
-        <w:t>15. Resultats et tests de demonstration</w:t>
-      </w:r>
-    </w:p>
-    <w:p>
-      <w:pPr>
-        <w:rPr>
-          <w:lang w:val="fr-FR"/>
-        </w:rPr>
-      </w:pPr>
-      <w:r>
-        <w:rPr>
-          <w:lang w:val="fr-FR"/>
-        </w:rPr>
-        <w:t>16. Gouvernance, responsabilite et limites</w:t>
-      </w:r>
-    </w:p>
-    <w:p>
-      <w:pPr>
-        <w:rPr>
-          <w:lang w:val="fr-FR"/>
-        </w:rPr>
-      </w:pPr>
-      <w:r>
-        <w:rPr>
-          <w:lang w:val="fr-FR"/>
-        </w:rPr>
-        <w:t>17. Limites et pistes d amelioration</w:t>
-      </w:r>
-    </w:p>
-    <w:p>
-      <w:pPr>
-        <w:rPr>
-          <w:lang w:val="fr-FR"/>
-        </w:rPr>
-      </w:pPr>
-      <w:r>
-        <w:rPr>
-          <w:lang w:val="fr-FR"/>
-        </w:rPr>
-        <w:t>18. Conclusion</w:t>
-      </w:r>
-    </w:p>
-    <w:p>
-      <w:pPr>
-        <w:rPr>
-          <w:lang w:val="fr-FR"/>
-        </w:rPr>
-      </w:pPr>
-      <w:r>
-        <w:rPr>
-          <w:lang w:val="fr-FR"/>
-        </w:rPr>
-        <w:t>19. Annexes</w:t>
+      <w:pPr/>
+      <w:r>
+        <w:t>13. Strategie d integration de l IA et feuille de route</w:t>
+      </w:r>
+    </w:p>
+    <w:p>
+      <w:pPr>
+        <w:rPr>
+          <w:lang w:val="fr-FR"/>
+        </w:rPr>
+      </w:pPr>
+      <w:r>
+        <w:rPr>
+          <w:lang w:val="fr-FR"/>
+        </w:rPr>
+        <w:t>14. Interface utilisateur et prototype</w:t>
+      </w:r>
+    </w:p>
+    <w:p>
+      <w:pPr>
+        <w:rPr>
+          <w:lang w:val="fr-FR"/>
+        </w:rPr>
+      </w:pPr>
+      <w:r>
+        <w:rPr>
+          <w:lang w:val="fr-FR"/>
+        </w:rPr>
+        <w:t>15. API REST (optionnelle)</w:t>
+      </w:r>
+    </w:p>
+    <w:p>
+      <w:pPr>
+        <w:rPr>
+          <w:lang w:val="fr-FR"/>
+        </w:rPr>
+      </w:pPr>
+      <w:r>
+        <w:rPr>
+          <w:lang w:val="fr-FR"/>
+        </w:rPr>
+        <w:t>16. Resultats et tests de demonstration</w:t>
+      </w:r>
+    </w:p>
+    <w:p>
+      <w:pPr>
+        <w:rPr>
+          <w:lang w:val="fr-FR"/>
+        </w:rPr>
+      </w:pPr>
+      <w:r>
+        <w:rPr>
+          <w:lang w:val="fr-FR"/>
+        </w:rPr>
+        <w:t>17. Gouvernance, responsabilite et limites</w:t>
+      </w:r>
+    </w:p>
+    <w:p>
+      <w:pPr>
+        <w:rPr>
+          <w:lang w:val="fr-FR"/>
+        </w:rPr>
+      </w:pPr>
+      <w:r>
+        <w:rPr>
+          <w:lang w:val="fr-FR"/>
+        </w:rPr>
+        <w:t>18. Limites et pistes d amelioration</w:t>
+      </w:r>
+    </w:p>
+    <w:p>
+      <w:pPr>
+        <w:rPr>
+          <w:lang w:val="fr-FR"/>
+        </w:rPr>
+      </w:pPr>
+      <w:r>
+        <w:rPr>
+          <w:lang w:val="fr-FR"/>
+        </w:rPr>
+        <w:t>19. Conclusion</w:t>
+      </w:r>
+    </w:p>
+    <w:p>
+      <w:pPr>
+        <w:rPr>
+          <w:lang w:val="fr-FR"/>
+        </w:rPr>
+      </w:pPr>
+      <w:r>
+        <w:rPr>
+          <w:lang w:val="fr-FR"/>
+        </w:rPr>
+        <w:t>20. Annexes</w:t>
       </w:r>
     </w:p>
     <w:p>
@@ -1686,6 +1692,12 @@
       </w:pPr>
     </w:p>
     <w:p>
+      <w:pPr/>
+      <w:r>
+        <w:t>Un controle de qualite a egalement ete effectue sur les doublons : aucune ligne dupliquee n a ete detectee sur les 10 000 clients (df.duplicated().sum() == 0), et aucun customer_id n apparait deux fois. Le dataset ne necessite donc pas de deduplication.</w:t>
+      </w:r>
+    </w:p>
+    <w:p>
       <w:pPr>
         <w:pStyle w:val="Titre3"/>
       </w:pPr>
@@ -2078,7 +2090,7 @@
         <w:rPr>
           <w:lang w:val="fr-FR"/>
         </w:rPr>
-        <w:t>7.4 Qualite et valeurs manquantes</w:t>
+        <w:t>7.4 Qualite, doublons et valeurs manquantes</w:t>
       </w:r>
     </w:p>
     <w:p>
@@ -2107,6 +2119,12 @@
           <w:lang w:val="fr-FR"/>
         </w:rPr>
       </w:pPr>
+    </w:p>
+    <w:p>
+      <w:pPr/>
+      <w:r>
+        <w:t>Le controle des doublons (notebook 01_EDA.ipynb) confirme 0 ligne dupliquee et 0 customer_id duplique. Les boxplots font apparaitre des valeurs extremes plausibles sur certaines variables (ex. total_revenue, support_tickets, payment_failures) : elles correspondent a des profils clients reels (tres actifs ou tres en difficulte) et non a des erreurs de saisie. Ces valeurs ne sont donc pas supprimees, car elles portent un signal metier pertinent pour la detection du churn.</w:t>
+      </w:r>
     </w:p>
     <w:p>
       <w:pPr>
@@ -3385,6 +3403,150 @@
     </w:p>
     <w:p>
       <w:pPr>
+        <w:pStyle w:val="Titre3"/>
+      </w:pPr>
+      <w:r>
+        <w:t>11.5 Cout de calcul et ecoresponsabilite</w:t>
+      </w:r>
+    </w:p>
+    <w:p>
+      <w:pPr/>
+      <w:r>
+        <w:t>La comparaison des modeles ne se limite pas a la performance statistique : le temps d entrainement de chaque experience a ete mesure (validation croisee 3 folds + entrainement final) et est disponible dans reports/model_comparison.csv (colonne temps_entrainement_secondes).</w:t>
+      </w:r>
+    </w:p>
+    <w:p>
+      <w:pPr/>
+    </w:p>
+    <w:tbl>
+      <w:tblPr>
+        <w:tblStyle w:val="Grilledutableau"/>
+        <w:tblW w:type="auto" w:w="0"/>
+        <w:tblLook w:firstColumn="1" w:firstRow="1" w:lastColumn="0" w:lastRow="0" w:noHBand="0" w:noVBand="1" w:val="04A0"/>
+      </w:tblPr>
+      <w:tblGrid>
+        <w:gridCol w:w="4320"/>
+        <w:gridCol w:w="4320"/>
+      </w:tblGrid>
+      <w:tr>
+        <w:tc>
+          <w:tcPr>
+            <w:tcW w:type="dxa" w:w="4320"/>
+          </w:tcPr>
+          <w:p>
+            <w:r>
+              <w:t>Modele</w:t>
+            </w:r>
+          </w:p>
+        </w:tc>
+        <w:tc>
+          <w:tcPr>
+            <w:tcW w:type="dxa" w:w="4320"/>
+          </w:tcPr>
+          <w:p>
+            <w:r>
+              <w:t>Temps d entrainement (s)</w:t>
+            </w:r>
+          </w:p>
+        </w:tc>
+      </w:tr>
+      <w:tr>
+        <w:tc>
+          <w:tcPr>
+            <w:tcW w:type="dxa" w:w="4320"/>
+          </w:tcPr>
+          <w:p>
+            <w:r>
+              <w:t>Logistic Regression (variantes)</w:t>
+            </w:r>
+          </w:p>
+        </w:tc>
+        <w:tc>
+          <w:tcPr>
+            <w:tcW w:type="dxa" w:w="4320"/>
+          </w:tcPr>
+          <w:p>
+            <w:r>
+              <w:t>0.25 a 2.12</w:t>
+            </w:r>
+          </w:p>
+        </w:tc>
+      </w:tr>
+      <w:tr>
+        <w:tc>
+          <w:tcPr>
+            <w:tcW w:type="dxa" w:w="4320"/>
+          </w:tcPr>
+          <w:p>
+            <w:r>
+              <w:t>XGBoost (scale_pos_weight, modele final)</w:t>
+            </w:r>
+          </w:p>
+        </w:tc>
+        <w:tc>
+          <w:tcPr>
+            <w:tcW w:type="dxa" w:w="4320"/>
+          </w:tcPr>
+          <w:p>
+            <w:r>
+              <w:t>1.44</w:t>
+            </w:r>
+          </w:p>
+        </w:tc>
+      </w:tr>
+      <w:tr>
+        <w:tc>
+          <w:tcPr>
+            <w:tcW w:type="dxa" w:w="4320"/>
+          </w:tcPr>
+          <w:p>
+            <w:r>
+              <w:t>Random Forest (variantes)</w:t>
+            </w:r>
+          </w:p>
+        </w:tc>
+        <w:tc>
+          <w:tcPr>
+            <w:tcW w:type="dxa" w:w="4320"/>
+          </w:tcPr>
+          <w:p>
+            <w:r>
+              <w:t>7.95 a 8.93</w:t>
+            </w:r>
+          </w:p>
+        </w:tc>
+      </w:tr>
+      <w:tr>
+        <w:tc>
+          <w:tcPr>
+            <w:tcW w:type="dxa" w:w="4320"/>
+          </w:tcPr>
+          <w:p>
+            <w:r>
+              <w:t>MLP / Deep Learning (SMOTE)</w:t>
+            </w:r>
+          </w:p>
+        </w:tc>
+        <w:tc>
+          <w:tcPr>
+            <w:tcW w:type="dxa" w:w="4320"/>
+          </w:tcPr>
+          <w:p>
+            <w:r>
+              <w:t>11.76</w:t>
+            </w:r>
+          </w:p>
+        </w:tc>
+      </w:tr>
+    </w:tbl>
+    <w:p>
+      <w:pPr/>
+      <w:r>
+        <w:t>XGBoost, le modele retenu, est environ 6 fois plus rapide a entrainer que Random Forest et 8 fois plus rapide que le MLP, pour un recall pourtant superieur. Dans une logique d ecoresponsabilite, ce point renforce le choix final : un reentrainement periodique reste peu couteux en ressources de calcul, contrairement a une solution Deep Learning qui demanderait davantage de temps et d energie pour un gain de performance qui, ici, n est pas au rendez-vous.</w:t>
+      </w:r>
+    </w:p>
+    <w:p>
+      <w:pPr>
         <w:pStyle w:val="Titre2"/>
         <w:rPr>
           <w:lang w:val="fr-FR"/>
@@ -3521,15 +3683,119 @@
     <w:p>
       <w:pPr>
         <w:pStyle w:val="Titre2"/>
-        <w:rPr>
-          <w:lang w:val="fr-FR"/>
-        </w:rPr>
-      </w:pPr>
-      <w:r>
-        <w:rPr>
-          <w:lang w:val="fr-FR"/>
-        </w:rPr>
-        <w:t>13. Interface utilisateur et prototype</w:t>
+      </w:pPr>
+      <w:r>
+        <w:t>13. Strategie d integration de l IA et feuille de route</w:t>
+      </w:r>
+    </w:p>
+    <w:p>
+      <w:pPr>
+        <w:pStyle w:val="Titre3"/>
+      </w:pPr>
+      <w:r>
+        <w:t>13.1 Cas d usage identifies</w:t>
+      </w:r>
+    </w:p>
+    <w:p>
+      <w:pPr/>
+      <w:r>
+        <w:t>Le projet traite la classification du churn comme cas d usage principal, mais le meme pipeline ouvre directement deux cas d usage complementaires, deja esquisses dans le dashboard ou dans les annexes : estimation du revenu a risque (revenu_a_risque = monthly_fee * proba_churn), deja calculee dans le dashboard pour prioriser les clients a forte valeur ; et segmentation des clients par risque et par valeur (cf. Annexe AD), pour adapter le type d action CRM (offre, support proactif, appel personnalise).</w:t>
+      </w:r>
+    </w:p>
+    <w:p>
+      <w:pPr>
+        <w:pStyle w:val="Titre3"/>
+      </w:pPr>
+      <w:r>
+        <w:t>13.2 Impact sur les processus metier</w:t>
+      </w:r>
+    </w:p>
+    <w:p>
+      <w:pPr/>
+      <w:r>
+        <w:t>L integration de ce modele dans le processus CRM change la maniere de selectionner les clients a contacter : au lieu d une liste arbitraire ou d un seul critere (anciennete, plaintes), l equipe priorise selon un score de risque et un revenu a risque combines. Cela concentre l effort commercial sur les clients ou il a le plus de valeur, et reduit le temps passe sur des clients a faible risque.</w:t>
+      </w:r>
+    </w:p>
+    <w:p>
+      <w:pPr>
+        <w:pStyle w:val="Titre3"/>
+      </w:pPr>
+      <w:r>
+        <w:t>13.3 Feuille de route realisable</w:t>
+      </w:r>
+    </w:p>
+    <w:p>
+      <w:pPr/>
+      <w:r>
+        <w:t>La strategie d integration est materialisee par une feuille de route en cinq etapes, deja detaillee en Annexe M et reprise ici de maniere visible :</w:t>
+      </w:r>
+    </w:p>
+    <w:p>
+      <w:pPr>
+        <w:pStyle w:val="Paragraphedeliste"/>
+      </w:pPr>
+      <w:r>
+        <w:t>1. Exposer le modele via une API REST (/predict, /health) pour le decoupler du dashboard.</w:t>
+      </w:r>
+    </w:p>
+    <w:p>
+      <w:pPr>
+        <w:pStyle w:val="Paragraphedeliste"/>
+      </w:pPr>
+      <w:r>
+        <w:t>2. Historiser les scores de churn dans une base de donnees pour suivre leur evolution dans le temps.</w:t>
+      </w:r>
+    </w:p>
+    <w:p>
+      <w:pPr>
+        <w:pStyle w:val="Paragraphedeliste"/>
+      </w:pPr>
+      <w:r>
+        <w:t>3. Connecter les scores a l outil CRM ou marketing automation utilise par l equipe.</w:t>
+      </w:r>
+    </w:p>
+    <w:p>
+      <w:pPr>
+        <w:pStyle w:val="Paragraphedeliste"/>
+      </w:pPr>
+      <w:r>
+        <w:t>4. Mettre en place un monitoring automatique des performances et de la derive des donnees.</w:t>
+      </w:r>
+    </w:p>
+    <w:p>
+      <w:pPr>
+        <w:pStyle w:val="Paragraphedeliste"/>
+      </w:pPr>
+      <w:r>
+        <w:t>5. Definir une gouvernance des seuils avec les equipes metier, revue periodiquement.</w:t>
+      </w:r>
+    </w:p>
+    <w:p>
+      <w:pPr>
+        <w:pStyle w:val="Titre3"/>
+      </w:pPr>
+      <w:r>
+        <w:t>13.4 Alignement avec les objectifs de gouvernance</w:t>
+      </w:r>
+    </w:p>
+    <w:p>
+      <w:pPr/>
+      <w:r>
+        <w:t>Cette feuille de route reste volontairement progressive : chaque etape peut etre validee independamment par la gouvernance avant de passer a la suivante, ce qui limite le risque d un deploiement trop rapide d un modele encore peu supervise. Elle est coherente avec l objectif de passer d une priorisation manuelle a une priorisation pilotee par les donnees, sans retirer la decision finale aux equipes metier.</w:t>
+      </w:r>
+    </w:p>
+    <w:p>
+      <w:pPr>
+        <w:pStyle w:val="Titre2"/>
+        <w:rPr>
+          <w:lang w:val="fr-FR"/>
+        </w:rPr>
+      </w:pPr>
+      <w:r>
+        <w:rPr>
+          <w:lang w:val="fr-FR"/>
+        </w:rPr>
+        <w:t>14. Interface utilisateur et prototype</w:t>
       </w:r>
     </w:p>
     <w:p>
@@ -3678,6 +3944,26 @@
     </w:p>
     <w:p>
       <w:pPr>
+        <w:pStyle w:val="Titre3"/>
+      </w:pPr>
+      <w:r>
+        <w:t>14.1 Inclusivite, accessibilite et drill-down</w:t>
+      </w:r>
+    </w:p>
+    <w:p>
+      <w:pPr/>
+      <w:r>
+        <w:t>Un filtre par segment client et par type de contrat a ete ajoute dans le tableau de bord pour permettre un drill-down : l utilisateur peut cibler une sous-population precise (ex. segment Enterprise en contrat mensuel) avant de lire les KPI et la liste des clients a risque.</w:t>
+      </w:r>
+    </w:p>
+    <w:p>
+      <w:pPr/>
+      <w:r>
+        <w:t>Le dashboard a egalement ete revu pour rester comprehensible par un utilisateur non technique : chaque indicateur cle (clients a risque, revenu a risque, recall, precision) est affiche en chiffre et en mots, pas seulement par une couleur. Les graphiques utilisent une palette de couleurs contrastees et facilement distinguables (bleu, orange, rouge, vert, violet), de maniere a rester lisibles meme pour un utilisateur daltonien. Le vocabulaire reste en langage metier plutot qu en jargon statistique, et la mise en page large (layout="wide") s adapte a differentes tailles d ecran.</w:t>
+      </w:r>
+    </w:p>
+    <w:p>
+      <w:pPr>
         <w:pStyle w:val="Titre2"/>
         <w:rPr>
           <w:lang w:val="fr-FR"/>
@@ -3687,7 +3973,7 @@
         <w:rPr>
           <w:lang w:val="fr-FR"/>
         </w:rPr>
-        <w:t>14. API REST (optionnelle)</w:t>
+        <w:t>15. API REST (optionnelle)</w:t>
       </w:r>
     </w:p>
     <w:p>
@@ -3742,7 +4028,7 @@
         <w:rPr>
           <w:lang w:val="fr-FR"/>
         </w:rPr>
-        <w:t>15. Resultats et tests de demonstration</w:t>
+        <w:t>16. Resultats et tests de demonstration</w:t>
       </w:r>
     </w:p>
     <w:p>
@@ -3866,7 +4152,7 @@
         <w:rPr>
           <w:lang w:val="fr-FR"/>
         </w:rPr>
-        <w:t>16. Gouvernance, responsabilite et limites</w:t>
+        <w:t>17. Gouvernance, responsabilite et limites</w:t>
       </w:r>
     </w:p>
     <w:p>
@@ -4019,7 +4305,7 @@
         <w:rPr>
           <w:lang w:val="fr-FR"/>
         </w:rPr>
-        <w:t>17. Limites et pistes d amelioration</w:t>
+        <w:t>18. Limites et pistes d amelioration</w:t>
       </w:r>
     </w:p>
     <w:p>
@@ -4227,7 +4513,7 @@
         <w:rPr>
           <w:lang w:val="fr-FR"/>
         </w:rPr>
-        <w:t>18. Conclusion</w:t>
+        <w:t>19. Conclusion</w:t>
       </w:r>
     </w:p>
     <w:p>
@@ -4322,7 +4608,7 @@
         <w:rPr>
           <w:lang w:val="fr-FR"/>
         </w:rPr>
-        <w:t>19. Annexes</w:t>
+        <w:t>20. Annexes</w:t>
       </w:r>
     </w:p>
     <w:p>

</xml_diff>